<commit_message>
Edit final documentation and update requirements.txt.
</commit_message>
<xml_diff>
--- a/5_final_documentation/CIP_FS26_111.docx
+++ b/5_final_documentation/CIP_FS26_111.docx
@@ -1,6 +1,6 @@
 
 <file path=word/document.xml><?xml version="1.0" encoding="utf-8"?>
-<w:document xmlns:wpc="http://schemas.microsoft.com/office/word/2010/wordprocessingCanvas" xmlns:cx="http://schemas.microsoft.com/office/drawing/2014/chartex" xmlns:cx1="http://schemas.microsoft.com/office/drawing/2015/9/8/chartex" xmlns:cx2="http://schemas.microsoft.com/office/drawing/2015/10/21/chartex" xmlns:cx3="http://schemas.microsoft.com/office/drawing/2016/5/9/chartex" xmlns:cx4="http://schemas.microsoft.com/office/drawing/2016/5/10/chartex" xmlns:cx5="http://schemas.microsoft.com/office/drawing/2016/5/11/chartex" xmlns:cx6="http://schemas.microsoft.com/office/drawing/2016/5/12/chartex" xmlns:cx7="http://schemas.microsoft.com/office/drawing/2016/5/13/chartex" xmlns:cx8="http://schemas.microsoft.com/office/drawing/2016/5/14/chartex" xmlns:mc="http://schemas.openxmlformats.org/markup-compatibility/2006" xmlns:aink="http://schemas.microsoft.com/office/drawing/2016/ink" xmlns:am3d="http://schemas.microsoft.com/office/drawing/2017/model3d" xmlns:o="urn:schemas-microsoft-com:office:office" xmlns:oel="http://schemas.microsoft.com/office/2019/extlst" xmlns:r="http://schemas.openxmlformats.org/officeDocument/2006/relationships" xmlns:m="http://schemas.openxmlformats.org/officeDocument/2006/math" xmlns:v="urn:schemas-microsoft-com:vml" xmlns:wp14="http://schemas.microsoft.com/office/word/2010/wordprocessingDrawing" xmlns:wp="http://schemas.openxmlformats.org/drawingml/2006/wordprocessingDrawing" xmlns:w10="urn:schemas-microsoft-com:office:word" xmlns:w="http://schemas.openxmlformats.org/wordprocessingml/2006/main" xmlns:w14="http://schemas.microsoft.com/office/word/2010/wordml" xmlns:w15="http://schemas.microsoft.com/office/word/2012/wordml" xmlns:w16cex="http://schemas.microsoft.com/office/word/2018/wordml/cex" xmlns:w16cid="http://schemas.microsoft.com/office/word/2016/wordml/cid" xmlns:w16="http://schemas.microsoft.com/office/word/2018/wordml" xmlns:w16du="http://schemas.microsoft.com/office/word/2023/wordml/word16du" xmlns:w16sdtdh="http://schemas.microsoft.com/office/word/2020/wordml/sdtdatahash" xmlns:w16sdtfl="http://schemas.microsoft.com/office/word/2024/wordml/sdtformatlock" xmlns:w16se="http://schemas.microsoft.com/office/word/2015/wordml/symex" xmlns:wpg="http://schemas.microsoft.com/office/word/2010/wordprocessingGroup" xmlns:wpi="http://schemas.microsoft.com/office/word/2010/wordprocessingInk" xmlns:wne="http://schemas.microsoft.com/office/word/2006/wordml" xmlns:wps="http://schemas.microsoft.com/office/word/2010/wordprocessingShape" mc:Ignorable="w14 w15 w16se w16cid w16 w16cex w16sdtdh w16sdtfl w16du wp14">
+<w:document xmlns:wpc="http://schemas.microsoft.com/office/word/2010/wordprocessingCanvas" xmlns:cx="http://schemas.microsoft.com/office/drawing/2014/chartex" xmlns:cx1="http://schemas.microsoft.com/office/drawing/2015/9/8/chartex" xmlns:cx2="http://schemas.microsoft.com/office/drawing/2015/10/21/chartex" xmlns:cx3="http://schemas.microsoft.com/office/drawing/2016/5/9/chartex" xmlns:cx4="http://schemas.microsoft.com/office/drawing/2016/5/10/chartex" xmlns:cx5="http://schemas.microsoft.com/office/drawing/2016/5/11/chartex" xmlns:cx6="http://schemas.microsoft.com/office/drawing/2016/5/12/chartex" xmlns:cx7="http://schemas.microsoft.com/office/drawing/2016/5/13/chartex" xmlns:cx8="http://schemas.microsoft.com/office/drawing/2016/5/14/chartex" xmlns:mc="http://schemas.openxmlformats.org/markup-compatibility/2006" xmlns:aink="http://schemas.microsoft.com/office/drawing/2016/ink" xmlns:am3d="http://schemas.microsoft.com/office/drawing/2017/model3d" xmlns:o="urn:schemas-microsoft-com:office:office" xmlns:oel="http://schemas.microsoft.com/office/2019/extlst" xmlns:r="http://schemas.openxmlformats.org/officeDocument/2006/relationships" xmlns:m="http://schemas.openxmlformats.org/officeDocument/2006/math" xmlns:v="urn:schemas-microsoft-com:vml" xmlns:wp14="http://schemas.microsoft.com/office/word/2010/wordprocessingDrawing" xmlns:wp="http://schemas.openxmlformats.org/drawingml/2006/wordprocessingDrawing" xmlns:w10="urn:schemas-microsoft-com:office:word" xmlns:w="http://schemas.openxmlformats.org/wordprocessingml/2006/main" xmlns:w14="http://schemas.microsoft.com/office/word/2010/wordml" xmlns:w15="http://schemas.microsoft.com/office/word/2012/wordml" xmlns:w16cex="http://schemas.microsoft.com/office/word/2018/wordml/cex" xmlns:w16cid="http://schemas.microsoft.com/office/word/2016/wordml/cid" xmlns:w16="http://schemas.microsoft.com/office/word/2018/wordml" xmlns:w16sdtdh="http://schemas.microsoft.com/office/word/2020/wordml/sdtdatahash" xmlns:w16se="http://schemas.microsoft.com/office/word/2015/wordml/symex" xmlns:wpg="http://schemas.microsoft.com/office/word/2010/wordprocessingGroup" xmlns:wpi="http://schemas.microsoft.com/office/word/2010/wordprocessingInk" xmlns:wne="http://schemas.microsoft.com/office/word/2006/wordml" xmlns:wps="http://schemas.microsoft.com/office/word/2010/wordprocessingShape" mc:Ignorable="w14 w15 w16se w16cid w16 w16cex w16sdtdh wp14">
   <w:body>
     <w:p>
       <w:pPr>
@@ -58,6 +58,7 @@
         <w:jc w:val="center"/>
         <w:rPr>
           <w:color w:val="000000"/>
+          <w:lang w:val="de-CH"/>
         </w:rPr>
       </w:pPr>
       <w:r>
@@ -65,9 +66,61 @@
           <w:b/>
           <w:bCs/>
           <w:color w:val="000000"/>
-        </w:rPr>
-        <w:t>Hanieh Jebeli · Elif Gürçınar · Silan Cihaner</w:t>
-      </w:r>
+          <w:lang w:val="de-CH"/>
+        </w:rPr>
+        <w:t xml:space="preserve">Hanieh Jebeli · Elif </w:t>
+      </w:r>
+      <w:proofErr w:type="spellStart"/>
+      <w:r>
+        <w:rPr>
+          <w:b/>
+          <w:bCs/>
+          <w:color w:val="000000"/>
+          <w:lang w:val="de-CH"/>
+        </w:rPr>
+        <w:t>Gürçınar</w:t>
+      </w:r>
+      <w:proofErr w:type="spellEnd"/>
+      <w:r>
+        <w:rPr>
+          <w:b/>
+          <w:bCs/>
+          <w:color w:val="000000"/>
+          <w:lang w:val="de-CH"/>
+        </w:rPr>
+        <w:t xml:space="preserve"> · </w:t>
+      </w:r>
+      <w:proofErr w:type="spellStart"/>
+      <w:r>
+        <w:rPr>
+          <w:b/>
+          <w:bCs/>
+          <w:color w:val="000000"/>
+          <w:lang w:val="de-CH"/>
+        </w:rPr>
+        <w:t>Silan</w:t>
+      </w:r>
+      <w:proofErr w:type="spellEnd"/>
+      <w:r>
+        <w:rPr>
+          <w:b/>
+          <w:bCs/>
+          <w:color w:val="000000"/>
+          <w:lang w:val="de-CH"/>
+        </w:rPr>
+        <w:t xml:space="preserve"> </w:t>
+      </w:r>
+      <w:proofErr w:type="spellStart"/>
+      <w:r>
+        <w:rPr>
+          <w:b/>
+          <w:bCs/>
+          <w:color w:val="000000"/>
+          <w:lang w:val="de-CH"/>
+        </w:rPr>
+        <w:t>Cihaner</w:t>
+      </w:r>
+      <w:proofErr w:type="spellEnd"/>
     </w:p>
     <w:tbl>
       <w:tblPr>
@@ -151,6 +204,7 @@
                 <w:color w:val="000000"/>
               </w:rPr>
             </w:pPr>
+            <w:proofErr w:type="spellStart"/>
             <w:r>
               <w:rPr>
                 <w:b/>
@@ -159,33 +213,9 @@
                 <w:sz w:val="20"/>
                 <w:szCs w:val="20"/>
               </w:rPr>
-              <w:t>Avg Delay</w:t>
-            </w:r>
-          </w:p>
-        </w:tc>
-        <w:tc>
-          <w:tcPr>
-            <w:tcW w:w="1872" w:type="dxa"/>
-            <w:tcBorders>
-              <w:top w:val="single" w:sz="4" w:space="0" w:color="BBCDE5"/>
-              <w:left w:val="single" w:sz="4" w:space="0" w:color="BBCDE5"/>
-              <w:bottom w:val="single" w:sz="4" w:space="0" w:color="BBCDE5"/>
-              <w:right w:val="single" w:sz="4" w:space="0" w:color="BBCDE5"/>
-            </w:tcBorders>
-            <w:tcMar>
-              <w:top w:w="80" w:type="dxa"/>
-              <w:left w:w="120" w:type="dxa"/>
-              <w:bottom w:w="80" w:type="dxa"/>
-              <w:right w:w="120" w:type="dxa"/>
-            </w:tcMar>
-            <w:vAlign w:val="center"/>
-          </w:tcPr>
-          <w:p>
-            <w:pPr>
-              <w:rPr>
-                <w:color w:val="000000"/>
-              </w:rPr>
-            </w:pPr>
+              <w:t>Avg</w:t>
+            </w:r>
+            <w:proofErr w:type="spellEnd"/>
             <w:r>
               <w:rPr>
                 <w:b/>
@@ -194,7 +224,7 @@
                 <w:sz w:val="20"/>
                 <w:szCs w:val="20"/>
               </w:rPr>
-              <w:t>On-Time Rate</w:t>
+              <w:t xml:space="preserve"> Delay</w:t>
             </w:r>
           </w:p>
         </w:tc>
@@ -229,7 +259,7 @@
                 <w:sz w:val="20"/>
                 <w:szCs w:val="20"/>
               </w:rPr>
-              <w:t>Airlines</w:t>
+              <w:t>On-Time Rate</w:t>
             </w:r>
           </w:p>
         </w:tc>
@@ -264,6 +294,41 @@
                 <w:sz w:val="20"/>
                 <w:szCs w:val="20"/>
               </w:rPr>
+              <w:t>Airlines</w:t>
+            </w:r>
+          </w:p>
+        </w:tc>
+        <w:tc>
+          <w:tcPr>
+            <w:tcW w:w="1872" w:type="dxa"/>
+            <w:tcBorders>
+              <w:top w:val="single" w:sz="4" w:space="0" w:color="BBCDE5"/>
+              <w:left w:val="single" w:sz="4" w:space="0" w:color="BBCDE5"/>
+              <w:bottom w:val="single" w:sz="4" w:space="0" w:color="BBCDE5"/>
+              <w:right w:val="single" w:sz="4" w:space="0" w:color="BBCDE5"/>
+            </w:tcBorders>
+            <w:tcMar>
+              <w:top w:w="80" w:type="dxa"/>
+              <w:left w:w="120" w:type="dxa"/>
+              <w:bottom w:w="80" w:type="dxa"/>
+              <w:right w:w="120" w:type="dxa"/>
+            </w:tcMar>
+            <w:vAlign w:val="center"/>
+          </w:tcPr>
+          <w:p>
+            <w:pPr>
+              <w:rPr>
+                <w:color w:val="000000"/>
+              </w:rPr>
+            </w:pPr>
+            <w:r>
+              <w:rPr>
+                <w:b/>
+                <w:bCs/>
+                <w:color w:val="000000"/>
+                <w:sz w:val="20"/>
+                <w:szCs w:val="20"/>
+              </w:rPr>
               <w:t>Routes</w:t>
             </w:r>
           </w:p>
@@ -442,7 +507,15 @@
     </w:p>
     <w:p>
       <w:r>
-        <w:t xml:space="preserve">Commercial airlines operate on exceptionally tight schedules, where even a minor departure delay can cascade into widespread operational disruptions and significant financial losses. This project develops a complete Python-based data science pipeline to analyze and predict flight departure delays at Zurich Airport (ZRH) over a three-month observation window spanning October 1 to December 31, 2025. The central objective is to identify the specific operational and meteorological factors that drive these delays, and to determine whether it is possible to predict the exact delay time in minutes using only information available prior to the scheduled departure. </w:t>
+        <w:t xml:space="preserve">Commercial airlines operate on exceptionally tight schedules, where even a minor departure delay can cascade into widespread operational disruptions and significant financial losses. This project develops a complete Python-based data science pipeline to </w:t>
+      </w:r>
+      <w:proofErr w:type="spellStart"/>
+      <w:r>
+        <w:t>analyze</w:t>
+      </w:r>
+      <w:proofErr w:type="spellEnd"/>
+      <w:r>
+        <w:t xml:space="preserve"> and predict flight departure delays at Zurich Airport (ZRH) over a three-month observation window spanning October 1 to December 31, 2025. The central objective is to identify the specific operational and meteorological factors that drive these delays, and to determine whether it is possible to predict the exact delay time in minutes using only information available prior to the scheduled departure. </w:t>
       </w:r>
     </w:p>
     <w:p/>
@@ -502,7 +575,15 @@
     </w:p>
     <w:p>
       <w:r>
-        <w:t>The project covers every stage of a complete data science workflow: API-based data acquisition, data cleaning and feature engineering, exploratory data analysis, predictive modelling, and the deployment of an interactive Streamlit dashboard as a decision-support tool.</w:t>
+        <w:t xml:space="preserve">The project covers every stage of a complete data science workflow: API-based data acquisition, data cleaning and feature engineering, exploratory data analysis, predictive modelling, and the deployment of an interactive </w:t>
+      </w:r>
+      <w:proofErr w:type="spellStart"/>
+      <w:r>
+        <w:t>Streamlit</w:t>
+      </w:r>
+      <w:proofErr w:type="spellEnd"/>
+      <w:r>
+        <w:t xml:space="preserve"> dashboard as a decision-support tool.</w:t>
       </w:r>
     </w:p>
     <w:p>
@@ -532,14 +613,64 @@
         <w:rPr>
           <w:color w:val="000000"/>
         </w:rPr>
-        <w:t xml:space="preserve">Flight operations data for ZRH were sourced from the AeroDataBox API, queried in 12-hour intervals using Python's requests library to respect RapidAPI rate limits. Automated try-except blocks captured HTTP 429 errors and ensured complete extraction of all flight records, including cancelled and codeshared flights. To avoid redundant API calls during iterative development, a local SQLite caching mechanism using requests-cache was integrated into the pipeline. </w:t>
+        <w:t xml:space="preserve">Flight operations data for ZRH were sourced from the </w:t>
+      </w:r>
+      <w:proofErr w:type="spellStart"/>
+      <w:r>
+        <w:rPr>
+          <w:color w:val="000000"/>
+        </w:rPr>
+        <w:t>AeroDataBox</w:t>
+      </w:r>
+      <w:proofErr w:type="spellEnd"/>
+      <w:r>
+        <w:rPr>
+          <w:color w:val="000000"/>
+        </w:rPr>
+        <w:t xml:space="preserve"> API, queried in 12-hour intervals using Python's requests library to respect </w:t>
+      </w:r>
+      <w:proofErr w:type="spellStart"/>
+      <w:r>
+        <w:rPr>
+          <w:color w:val="000000"/>
+        </w:rPr>
+        <w:t>RapidAPI</w:t>
+      </w:r>
+      <w:proofErr w:type="spellEnd"/>
+      <w:r>
+        <w:rPr>
+          <w:color w:val="000000"/>
+        </w:rPr>
+        <w:t xml:space="preserve"> rate limits. Automated try-except blocks captured HTTP 429 errors and ensured complete extraction of all flight records, including cancelled and </w:t>
+      </w:r>
+      <w:proofErr w:type="spellStart"/>
+      <w:r>
+        <w:rPr>
+          <w:color w:val="000000"/>
+        </w:rPr>
+        <w:t>codeshared</w:t>
+      </w:r>
+      <w:proofErr w:type="spellEnd"/>
+      <w:r>
+        <w:rPr>
+          <w:color w:val="000000"/>
+        </w:rPr>
+        <w:t xml:space="preserve"> flights. To avoid redundant API calls during iterative development, a local SQLite caching mechanism using requests-cache was integrated into the pipeline. </w:t>
       </w:r>
       <w:r>
         <w:t xml:space="preserve">Hourly </w:t>
       </w:r>
       <w:r>
         <w:lastRenderedPageBreak/>
-        <w:t>meteorological data, temperature (°C), precipitation (mm), and wind speed (km/h), were retrieved from the Open-Meteo API and joined to the flight records by timestamp.</w:t>
+        <w:t>meteorological data, temperature (°C), precipitation (mm), and wind speed (km/h), were retrieved from the Open-</w:t>
+      </w:r>
+      <w:proofErr w:type="spellStart"/>
+      <w:r>
+        <w:t>Meteo</w:t>
+      </w:r>
+      <w:proofErr w:type="spellEnd"/>
+      <w:r>
+        <w:t xml:space="preserve"> API and joined to the flight records by timestamp.</w:t>
       </w:r>
     </w:p>
     <w:p>
@@ -582,7 +713,21 @@
         <w:rPr>
           <w:color w:val="000000"/>
         </w:rPr>
-        <w:t>were parsed to extract structured fields. The target variable, delay_min, was computed as the difference in minutes between the scheduled and revised departure times. Outliers were flagged using an IQR-based methodology and excluded from modelling. A secondary filter restricted the analysis to flights with delays in the range of -60 to +300 minutes to remove likely data errors such as timestamps belonging to the following day's flight. After cleaning, the dataset contained 29,896 flights.</w:t>
+        <w:t xml:space="preserve">were parsed to extract structured fields. The target variable, </w:t>
+      </w:r>
+      <w:proofErr w:type="spellStart"/>
+      <w:r>
+        <w:rPr>
+          <w:color w:val="000000"/>
+        </w:rPr>
+        <w:t>delay_min</w:t>
+      </w:r>
+      <w:proofErr w:type="spellEnd"/>
+      <w:r>
+        <w:rPr>
+          <w:color w:val="000000"/>
+        </w:rPr>
+        <w:t>, was computed as the difference in minutes between the scheduled and revised departure times. Outliers were flagged using an IQR-based methodology and excluded from modelling. A secondary filter restricted the analysis to flights with delays in the range of -60 to +300 minutes to remove likely data errors such as timestamps belonging to the following day's flight. After cleaning, the dataset contained 29,896 flights.</w:t>
       </w:r>
     </w:p>
     <w:p>
@@ -596,8 +741,72 @@
         <w:rPr>
           <w:color w:val="000000"/>
         </w:rPr>
-        <w:t>Key engineered features included: departure hour (dep_hour), day of week (dep_dow), month (dep_month), a binary weekend flag (is_weekend), and route_avg_delay</w:t>
-      </w:r>
+        <w:t>Key engineered features included: departure hour (</w:t>
+      </w:r>
+      <w:proofErr w:type="spellStart"/>
+      <w:r>
+        <w:rPr>
+          <w:color w:val="000000"/>
+        </w:rPr>
+        <w:t>dep_hour</w:t>
+      </w:r>
+      <w:proofErr w:type="spellEnd"/>
+      <w:r>
+        <w:rPr>
+          <w:color w:val="000000"/>
+        </w:rPr>
+        <w:t>), day of week (</w:t>
+      </w:r>
+      <w:proofErr w:type="spellStart"/>
+      <w:r>
+        <w:rPr>
+          <w:color w:val="000000"/>
+        </w:rPr>
+        <w:t>dep_dow</w:t>
+      </w:r>
+      <w:proofErr w:type="spellEnd"/>
+      <w:r>
+        <w:rPr>
+          <w:color w:val="000000"/>
+        </w:rPr>
+        <w:t>), month (</w:t>
+      </w:r>
+      <w:proofErr w:type="spellStart"/>
+      <w:r>
+        <w:rPr>
+          <w:color w:val="000000"/>
+        </w:rPr>
+        <w:t>dep_month</w:t>
+      </w:r>
+      <w:proofErr w:type="spellEnd"/>
+      <w:r>
+        <w:rPr>
+          <w:color w:val="000000"/>
+        </w:rPr>
+        <w:t>), a binary weekend flag (</w:t>
+      </w:r>
+      <w:proofErr w:type="spellStart"/>
+      <w:r>
+        <w:rPr>
+          <w:color w:val="000000"/>
+        </w:rPr>
+        <w:t>is_weekend</w:t>
+      </w:r>
+      <w:proofErr w:type="spellEnd"/>
+      <w:r>
+        <w:rPr>
+          <w:color w:val="000000"/>
+        </w:rPr>
+        <w:t xml:space="preserve">), and </w:t>
+      </w:r>
+      <w:proofErr w:type="spellStart"/>
+      <w:r>
+        <w:rPr>
+          <w:color w:val="000000"/>
+        </w:rPr>
+        <w:t>route_avg_delay</w:t>
+      </w:r>
+      <w:proofErr w:type="spellEnd"/>
       <w:r>
         <w:t xml:space="preserve">, </w:t>
       </w:r>
@@ -630,7 +839,35 @@
         <w:rPr>
           <w:color w:val="000000"/>
         </w:rPr>
-        <w:t>Two modelling scripts were developed iteratively. The first (analysis_v01.py) established a baseline using only operational features, progressively adding route_avg_delay to assess its contribution. The second (analysis_v02_with_weather.py) extended the feature set with the three weather variables and compared all four model combinations on a consistent 80/20 train-test split with a fixed random seed (42). The models evaluated were Linear Regression (LR) and Random Forest Regressor (RF). Performance was assessed using Mean Absolute Error (MAE), Root Mean Squared Error (RMSE), and the coefficient of determination (R²). Feature importances were extracted from the best-performing Random Forest configuration.</w:t>
+        <w:t xml:space="preserve">Two modelling scripts were developed iteratively. The first (analysis_v01.py) established a baseline using only operational features, progressively adding </w:t>
+      </w:r>
+      <w:proofErr w:type="spellStart"/>
+      <w:r>
+        <w:rPr>
+          <w:color w:val="000000"/>
+        </w:rPr>
+        <w:t>route_avg_delay</w:t>
+      </w:r>
+      <w:proofErr w:type="spellEnd"/>
+      <w:r>
+        <w:rPr>
+          <w:color w:val="000000"/>
+        </w:rPr>
+        <w:t xml:space="preserve"> to assess its contribution. The second (analysis_v02_with_weather.py) extended the feature set with the three weather variables and compared all four model combinations on a consistent 80/20 train-test split with a fixed random seed (42). The models evaluated were Linear Regression (LR) and Random Forest Regressor (RF). Performance was assessed using Mean Absolute Error (MAE), Root Mean Squared Error (RMSE), and the coefficient of determination (R²). Feature </w:t>
+      </w:r>
+      <w:proofErr w:type="spellStart"/>
+      <w:r>
+        <w:rPr>
+          <w:color w:val="000000"/>
+        </w:rPr>
+        <w:t>importances</w:t>
+      </w:r>
+      <w:proofErr w:type="spellEnd"/>
+      <w:r>
+        <w:rPr>
+          <w:color w:val="000000"/>
+        </w:rPr>
+        <w:t xml:space="preserve"> were extracted from the best-performing Random Forest configuration.</w:t>
       </w:r>
     </w:p>
     <w:p>
@@ -655,7 +892,21 @@
         <w:rPr>
           <w:color w:val="000000"/>
         </w:rPr>
-        <w:t>The project outputs were deployed as an interactive Streamlit dashboard (dashboard.py), accessible at https://zrh-flight-delay.streamlit.app. The dashboard comprises four tabs: a Delay Explorer with filterable delay distribution, temporal patterns by hour and day of week, airline and aircraft breakdowns, and a delay heatmap by hour and day; a Weather Analysis tab with correlation charts; a Predictive Models tab displaying comparative model metrics; and a Live Predictor tab enabling users to input flight-specific parameters and receive an instant delay prediction from the trained model.</w:t>
+        <w:t xml:space="preserve">The project outputs were deployed as an interactive </w:t>
+      </w:r>
+      <w:proofErr w:type="spellStart"/>
+      <w:r>
+        <w:rPr>
+          <w:color w:val="000000"/>
+        </w:rPr>
+        <w:t>Streamlit</w:t>
+      </w:r>
+      <w:proofErr w:type="spellEnd"/>
+      <w:r>
+        <w:rPr>
+          <w:color w:val="000000"/>
+        </w:rPr>
+        <w:t xml:space="preserve"> dashboard (dashboard.py), accessible at https://zrh-flight-delay.streamlit.app. The dashboard comprises four tabs: a Delay Explorer with filterable delay distribution, temporal patterns by hour and day of week, airline and aircraft breakdowns, and a delay heatmap by hour and day; a Weather Analysis tab with correlation charts; a Predictive Models tab displaying comparative model metrics; and a Live Predictor tab enabling users to input flight-specific parameters and receive an instant delay prediction from the trained model.</w:t>
       </w:r>
     </w:p>
     <w:p>
@@ -695,12 +946,40 @@
           <w:color w:val="000000"/>
         </w:rPr>
       </w:pPr>
+      <w:commentRangeStart w:id="0"/>
       <w:r>
         <w:rPr>
           <w:color w:val="000000"/>
         </w:rPr>
         <w:lastRenderedPageBreak/>
-        <w:t>Temporal patterns visible in the dashboard reveal that average delays increase noticeably in the morning peak around 08:00–09:00 UTC (reaching approximately 8 minutes), then taper during midday and rise again in the late afternoon. Friday shows the highest average delay by day of week at 6.7 minutes, while Tuesday is the lowest at 3.8 minutes. Wide-body aircraft record the highest average delay by aircraft family (7.5 minutes), likely reflecting the longer turnaround and coordination requirements of long-haul operations. Among airlines with at least 50 flights, Lufthansa (n = 519) records an average delay of approximately 8 minutes, while Sun Express and KM Malta also exceed 8 minutes.</w:t>
+        <w:t xml:space="preserve">Temporal patterns visible in the dashboard reveal that average delays increase noticeably in the morning peak around 08:00–09:00 UTC (reaching approximately 8 minutes), then taper during midday and rise again in the late afternoon. Friday shows the highest average delay by day of week at 6.7 minutes, while Tuesday is the lowest at 3.8 minutes. Wide-body aircraft record the highest average delay by aircraft family (7.5 minutes), likely reflecting the longer turnaround and coordination requirements of long-haul operations. Among airlines with at least 50 flights, Lufthansa </w:t>
+      </w:r>
+      <w:commentRangeStart w:id="1"/>
+      <w:r>
+        <w:rPr>
+          <w:color w:val="000000"/>
+        </w:rPr>
+        <w:t xml:space="preserve">(n = 519) records an average </w:t>
+      </w:r>
+      <w:commentRangeEnd w:id="1"/>
+      <w:r>
+        <w:rPr>
+          <w:rStyle w:val="CommentReference"/>
+        </w:rPr>
+        <w:commentReference w:id="1"/>
+      </w:r>
+      <w:r>
+        <w:rPr>
+          <w:color w:val="000000"/>
+        </w:rPr>
+        <w:t>delay of approximately 8 minutes, while Sun Express and KM Malta also exceed 8 minutes.</w:t>
+      </w:r>
+      <w:commentRangeEnd w:id="0"/>
+      <w:r>
+        <w:rPr>
+          <w:rStyle w:val="CommentReference"/>
+        </w:rPr>
+        <w:commentReference w:id="0"/>
       </w:r>
     </w:p>
     <w:p>
@@ -741,7 +1020,7 @@
                     <pic:cNvPicPr preferRelativeResize="0"/>
                   </pic:nvPicPr>
                   <pic:blipFill>
-                    <a:blip r:embed="rId4"/>
+                    <a:blip r:embed="rId9"/>
                     <a:srcRect/>
                     <a:stretch>
                       <a:fillRect/>
@@ -2172,21 +2451,21 @@
         <w:rPr>
           <w:color w:val="000000"/>
         </w:rPr>
-        <w:t xml:space="preserve">The negative R² for the baseline Random Forest is a meaningful finding. In the first analysis script (analysis_v01.py), it was noted in the code comments that route_avg_delay, while appearing important in the Random Forest's feature importance ranking, showed no meaningful trend in a scatter plot against actual delay. This suggests the model was exploiting the many available numeric split points in that continuous feature without capturing genuine predictive signal — a form of overfitting to training data structure rather than true relationships. Linear Regression, being constrained to linear combinations, is immune to this </w:t>
-      </w:r>
-      <w:proofErr w:type="gramStart"/>
-      <w:r>
-        <w:rPr>
-          <w:color w:val="000000"/>
-        </w:rPr>
-        <w:t>particular failure</w:t>
-      </w:r>
-      <w:proofErr w:type="gramEnd"/>
-      <w:r>
-        <w:rPr>
-          <w:color w:val="000000"/>
-        </w:rPr>
-        <w:t xml:space="preserve"> mode given this dataset.</w:t>
+        <w:t xml:space="preserve">The negative R² for the baseline Random Forest is a meaningful finding. In the first analysis script (analysis_v01.py), it was noted in the code comments that </w:t>
+      </w:r>
+      <w:proofErr w:type="spellStart"/>
+      <w:r>
+        <w:rPr>
+          <w:color w:val="000000"/>
+        </w:rPr>
+        <w:t>route_avg_delay</w:t>
+      </w:r>
+      <w:proofErr w:type="spellEnd"/>
+      <w:r>
+        <w:rPr>
+          <w:color w:val="000000"/>
+        </w:rPr>
+        <w:t>, while appearing important in the Random Forest's feature importance ranking, showed no meaningful trend in a scatter plot against actual delay. This suggests the model was exploiting the many available numeric split points in that continuous feature without capturing genuine predictive signal — a form of overfitting to training data structure rather than true relationships. Linear Regression, being constrained to linear combinations, is immune to this particular failure mode given this dataset.</w:t>
       </w:r>
     </w:p>
     <w:p>
@@ -2209,21 +2488,7 @@
         <w:rPr>
           <w:color w:val="000000"/>
         </w:rPr>
-        <w:t xml:space="preserve">caused by inbound aircraft arriving late, crew rotation requirements, or network-level cascading effects that are </w:t>
-      </w:r>
-      <w:proofErr w:type="gramStart"/>
-      <w:r>
-        <w:rPr>
-          <w:color w:val="000000"/>
-        </w:rPr>
-        <w:t>by definition absent</w:t>
-      </w:r>
-      <w:proofErr w:type="gramEnd"/>
-      <w:r>
-        <w:rPr>
-          <w:color w:val="000000"/>
-        </w:rPr>
-        <w:t xml:space="preserve"> from pre-departure data. No pre-departure dataset can fully capture these dynamics, and the results confirm this fundamental ceiling on predictability given the available features.</w:t>
+        <w:t>caused by inbound aircraft arriving late, crew rotation requirements, or network-level cascading effects that are by definition absent from pre-departure data. No pre-departure dataset can fully capture these dynamics, and the results confirm this fundamental ceiling on predictability given the available features.</w:t>
       </w:r>
     </w:p>
     <w:p>
@@ -2263,7 +2528,7 @@
                     <pic:cNvPicPr preferRelativeResize="0"/>
                   </pic:nvPicPr>
                   <pic:blipFill>
-                    <a:blip r:embed="rId5"/>
+                    <a:blip r:embed="rId10"/>
                     <a:srcRect/>
                     <a:stretch>
                       <a:fillRect/>
@@ -2302,7 +2567,29 @@
           <w:sz w:val="18"/>
           <w:szCs w:val="18"/>
         </w:rPr>
-        <w:t>Figure 6 – Feature importance scores from the Random Forest Regressor (with weather features). Route Avg Delay (highlighted in orange) dominates at 0.41; all other features shown in blue in descending order.</w:t>
+        <w:t xml:space="preserve">Figure 6 – Feature importance scores from the Random Forest Regressor (with weather features). Route </w:t>
+      </w:r>
+      <w:proofErr w:type="spellStart"/>
+      <w:r>
+        <w:rPr>
+          <w:i/>
+          <w:iCs/>
+          <w:color w:val="000000"/>
+          <w:sz w:val="18"/>
+          <w:szCs w:val="18"/>
+        </w:rPr>
+        <w:t>Avg</w:t>
+      </w:r>
+      <w:proofErr w:type="spellEnd"/>
+      <w:r>
+        <w:rPr>
+          <w:i/>
+          <w:iCs/>
+          <w:color w:val="000000"/>
+          <w:sz w:val="18"/>
+          <w:szCs w:val="18"/>
+        </w:rPr>
+        <w:t xml:space="preserve"> Delay (highlighted in orange) dominates at 0.41; all other features shown in blue in descending order.</w:t>
       </w:r>
     </w:p>
     <w:p>
@@ -2339,7 +2626,21 @@
         <w:rPr>
           <w:color w:val="000000"/>
         </w:rPr>
-        <w:t>The prominence of route_avg_delay aligns with aviation domain knowledge: routes with structurally longer average delays, often longer international or connecting routes where reactionary delays are more common</w:t>
+        <w:t xml:space="preserve">The prominence of </w:t>
+      </w:r>
+      <w:proofErr w:type="spellStart"/>
+      <w:r>
+        <w:rPr>
+          <w:color w:val="000000"/>
+        </w:rPr>
+        <w:t>route_avg_delay</w:t>
+      </w:r>
+      <w:proofErr w:type="spellEnd"/>
+      <w:r>
+        <w:rPr>
+          <w:color w:val="000000"/>
+        </w:rPr>
+        <w:t xml:space="preserve"> aligns with aviation domain knowledge: routes with structurally longer average delays, often longer international or connecting routes where reactionary delays are more common</w:t>
       </w:r>
       <w:r>
         <w:t xml:space="preserve">, </w:t>
@@ -2362,21 +2663,7 @@
         <w:rPr>
           <w:color w:val="000000"/>
         </w:rPr>
-        <w:t xml:space="preserve">Weather variables occupy the middle tier of importance. While their linear correlations with delay are weak (Figure 1), the Random Forest </w:t>
-      </w:r>
-      <w:proofErr w:type="gramStart"/>
-      <w:r>
-        <w:rPr>
-          <w:color w:val="000000"/>
-        </w:rPr>
-        <w:t>is able to</w:t>
-      </w:r>
-      <w:proofErr w:type="gramEnd"/>
-      <w:r>
-        <w:rPr>
-          <w:color w:val="000000"/>
-        </w:rPr>
-        <w:t xml:space="preserve"> capture non-linear threshold effects</w:t>
+        <w:t>Weather variables occupy the middle tier of importance. While their linear correlations with delay are weak (Figure 1), the Random Forest is able to capture non-linear threshold effects</w:t>
       </w:r>
       <w:r>
         <w:t>.</w:t>
@@ -2434,21 +2721,7 @@
         <w:rPr>
           <w:color w:val="000000"/>
         </w:rPr>
-        <w:t xml:space="preserve">This project delivered a complete end-to-end data science pipeline for flight delay analysis and prediction at Zurich Airport. The dataset of 29,896 flights revealed that </w:t>
-      </w:r>
-      <w:proofErr w:type="gramStart"/>
-      <w:r>
-        <w:rPr>
-          <w:color w:val="000000"/>
-        </w:rPr>
-        <w:t>the majority of</w:t>
-      </w:r>
-      <w:proofErr w:type="gramEnd"/>
-      <w:r>
-        <w:rPr>
-          <w:color w:val="000000"/>
-        </w:rPr>
-        <w:t xml:space="preserve"> departures </w:t>
+        <w:t xml:space="preserve">This project delivered a complete end-to-end data science pipeline for flight delay analysis and prediction at Zurich Airport. The dataset of 29,896 flights revealed that the majority of departures </w:t>
       </w:r>
       <w:r>
         <w:rPr>
@@ -2509,7 +2782,35 @@
         <w:rPr>
           <w:color w:val="000000"/>
         </w:rPr>
-        <w:t xml:space="preserve"> are not present in the pre-departure data available through the AeroDataBox API, creating a structural ceiling on predictive performance. The Random Forest's tendency to overfit on high-cardinality continuous features such as route_avg_delay also warrants caution when interpreting feature importance rankings.</w:t>
+        <w:t xml:space="preserve"> are not present in the pre-departure data available through the </w:t>
+      </w:r>
+      <w:proofErr w:type="spellStart"/>
+      <w:r>
+        <w:rPr>
+          <w:color w:val="000000"/>
+        </w:rPr>
+        <w:t>AeroDataBox</w:t>
+      </w:r>
+      <w:proofErr w:type="spellEnd"/>
+      <w:r>
+        <w:rPr>
+          <w:color w:val="000000"/>
+        </w:rPr>
+        <w:t xml:space="preserve"> API, creating a structural ceiling on predictive performance. The Random Forest's tendency to overfit on high-cardinality continuous features such as </w:t>
+      </w:r>
+      <w:proofErr w:type="spellStart"/>
+      <w:r>
+        <w:rPr>
+          <w:color w:val="000000"/>
+        </w:rPr>
+        <w:t>route_avg_delay</w:t>
+      </w:r>
+      <w:proofErr w:type="spellEnd"/>
+      <w:r>
+        <w:rPr>
+          <w:color w:val="000000"/>
+        </w:rPr>
+        <w:t xml:space="preserve"> also warrants caution when interpreting feature importance rankings.</w:t>
       </w:r>
     </w:p>
     <w:p>
@@ -2547,8 +2848,317 @@
 </w:document>
 </file>
 
+<file path=word/comments.xml><?xml version="1.0" encoding="utf-8"?>
+<w:comments xmlns:wpc="http://schemas.microsoft.com/office/word/2010/wordprocessingCanvas" xmlns:cx="http://schemas.microsoft.com/office/drawing/2014/chartex" xmlns:cx1="http://schemas.microsoft.com/office/drawing/2015/9/8/chartex" xmlns:cx2="http://schemas.microsoft.com/office/drawing/2015/10/21/chartex" xmlns:cx3="http://schemas.microsoft.com/office/drawing/2016/5/9/chartex" xmlns:cx4="http://schemas.microsoft.com/office/drawing/2016/5/10/chartex" xmlns:cx5="http://schemas.microsoft.com/office/drawing/2016/5/11/chartex" xmlns:cx6="http://schemas.microsoft.com/office/drawing/2016/5/12/chartex" xmlns:cx7="http://schemas.microsoft.com/office/drawing/2016/5/13/chartex" xmlns:cx8="http://schemas.microsoft.com/office/drawing/2016/5/14/chartex" xmlns:mc="http://schemas.openxmlformats.org/markup-compatibility/2006" xmlns:aink="http://schemas.microsoft.com/office/drawing/2016/ink" xmlns:am3d="http://schemas.microsoft.com/office/drawing/2017/model3d" xmlns:o="urn:schemas-microsoft-com:office:office" xmlns:oel="http://schemas.microsoft.com/office/2019/extlst" xmlns:r="http://schemas.openxmlformats.org/officeDocument/2006/relationships" xmlns:m="http://schemas.openxmlformats.org/officeDocument/2006/math" xmlns:v="urn:schemas-microsoft-com:vml" xmlns:wp14="http://schemas.microsoft.com/office/word/2010/wordprocessingDrawing" xmlns:wp="http://schemas.openxmlformats.org/drawingml/2006/wordprocessingDrawing" xmlns:w10="urn:schemas-microsoft-com:office:word" xmlns:w="http://schemas.openxmlformats.org/wordprocessingml/2006/main" xmlns:w14="http://schemas.microsoft.com/office/word/2010/wordml" xmlns:w15="http://schemas.microsoft.com/office/word/2012/wordml" xmlns:w16cex="http://schemas.microsoft.com/office/word/2018/wordml/cex" xmlns:w16cid="http://schemas.microsoft.com/office/word/2016/wordml/cid" xmlns:w16="http://schemas.microsoft.com/office/word/2018/wordml" xmlns:w16sdtdh="http://schemas.microsoft.com/office/word/2020/wordml/sdtdatahash" xmlns:w16se="http://schemas.microsoft.com/office/word/2015/wordml/symex" xmlns:wpg="http://schemas.microsoft.com/office/word/2010/wordprocessingGroup" xmlns:wpi="http://schemas.microsoft.com/office/word/2010/wordprocessingInk" xmlns:wne="http://schemas.microsoft.com/office/word/2006/wordml" xmlns:wps="http://schemas.microsoft.com/office/word/2010/wordprocessingShape" mc:Ignorable="w14 w15 w16se w16cid w16 w16cex w16sdtdh wp14">
+  <w:comment w:id="1" w:author="Haniyeh Jebelli" w:date="2026-04-09T09:46:00Z" w:initials="HJ">
+    <w:p>
+      <w:pPr>
+        <w:pStyle w:val="CommentText"/>
+      </w:pPr>
+      <w:r>
+        <w:rPr>
+          <w:rStyle w:val="CommentReference"/>
+        </w:rPr>
+        <w:annotationRef/>
+      </w:r>
+      <w:r>
+        <w:t xml:space="preserve">The actual top delayed airlines (≥50 flights) are TAP Air Portugal (13.0 min), El Al (12.4 min), </w:t>
+      </w:r>
+      <w:proofErr w:type="spellStart"/>
+      <w:r>
+        <w:t>AJet</w:t>
+      </w:r>
+      <w:proofErr w:type="spellEnd"/>
+      <w:r>
+        <w:t xml:space="preserve"> (11.6 min). Lufthansa has only </w:t>
+      </w:r>
+      <w:r>
+        <w:rPr>
+          <w:rStyle w:val="Strong"/>
+        </w:rPr>
+        <w:t>8.79 min</w:t>
+      </w:r>
+    </w:p>
+  </w:comment>
+  <w:comment w:id="0" w:author="Haniyeh Jebelli" w:date="2026-04-09T09:45:00Z" w:initials="HJ">
+    <w:p>
+      <w:pPr>
+        <w:pStyle w:val="font-claude-response-body"/>
+      </w:pPr>
+      <w:r>
+        <w:rPr>
+          <w:rStyle w:val="CommentReference"/>
+        </w:rPr>
+        <w:annotationRef/>
+      </w:r>
+      <w:r>
+        <w:t>The code shows:</w:t>
+      </w:r>
+    </w:p>
+    <w:p>
+      <w:pPr>
+        <w:pStyle w:val="whitespace-normal"/>
+      </w:pPr>
+      <w:r>
+        <w:t xml:space="preserve">08:00 = </w:t>
+      </w:r>
+      <w:r>
+        <w:rPr>
+          <w:rStyle w:val="Strong"/>
+        </w:rPr>
+        <w:t>4.67 min</w:t>
+      </w:r>
+    </w:p>
+    <w:p>
+      <w:pPr>
+        <w:pStyle w:val="whitespace-normal"/>
+      </w:pPr>
+      <w:r>
+        <w:t xml:space="preserve">9:00 = </w:t>
+      </w:r>
+      <w:r>
+        <w:rPr>
+          <w:rStyle w:val="Strong"/>
+        </w:rPr>
+        <w:t>4.83 min</w:t>
+      </w:r>
+    </w:p>
+    <w:p>
+      <w:pPr>
+        <w:pStyle w:val="whitespace-normal"/>
+      </w:pPr>
+      <w:r>
+        <w:rPr>
+          <w:rStyle w:val="Strong"/>
+          <w:b w:val="0"/>
+          <w:bCs w:val="0"/>
+        </w:rPr>
+        <w:t>11:00</w:t>
+      </w:r>
+      <w:r>
+        <w:rPr>
+          <w:rStyle w:val="Strong"/>
+        </w:rPr>
+        <w:t xml:space="preserve"> = 8.04 min</w:t>
+      </w:r>
+      <w:r>
+        <w:t xml:space="preserve"> ← actual peak</w:t>
+      </w:r>
+    </w:p>
+    <w:p>
+      <w:pPr>
+        <w:pStyle w:val="font-claude-response-body"/>
+      </w:pPr>
+      <w:r>
+        <w:rPr>
+          <w:rStyle w:val="Strong"/>
+        </w:rPr>
+        <w:t>Fix:</w:t>
+      </w:r>
+      <w:r>
+        <w:t xml:space="preserve"> Change "08:00–09:00" to "10:00–11:00 UTC" in Section 3.1.</w:t>
+      </w:r>
+    </w:p>
+    <w:p>
+      <w:pPr>
+        <w:pStyle w:val="CommentText"/>
+        <w:rPr>
+          <w:lang w:val="en-CH"/>
+        </w:rPr>
+      </w:pPr>
+    </w:p>
+  </w:comment>
+</w:comments>
+</file>
+
+<file path=word/commentsExtended.xml><?xml version="1.0" encoding="utf-8"?>
+<w15:commentsEx xmlns:wpc="http://schemas.microsoft.com/office/word/2010/wordprocessingCanvas" xmlns:cx="http://schemas.microsoft.com/office/drawing/2014/chartex" xmlns:cx1="http://schemas.microsoft.com/office/drawing/2015/9/8/chartex" xmlns:cx2="http://schemas.microsoft.com/office/drawing/2015/10/21/chartex" xmlns:cx3="http://schemas.microsoft.com/office/drawing/2016/5/9/chartex" xmlns:cx4="http://schemas.microsoft.com/office/drawing/2016/5/10/chartex" xmlns:cx5="http://schemas.microsoft.com/office/drawing/2016/5/11/chartex" xmlns:cx6="http://schemas.microsoft.com/office/drawing/2016/5/12/chartex" xmlns:cx7="http://schemas.microsoft.com/office/drawing/2016/5/13/chartex" xmlns:cx8="http://schemas.microsoft.com/office/drawing/2016/5/14/chartex" xmlns:mc="http://schemas.openxmlformats.org/markup-compatibility/2006" xmlns:aink="http://schemas.microsoft.com/office/drawing/2016/ink" xmlns:am3d="http://schemas.microsoft.com/office/drawing/2017/model3d" xmlns:o="urn:schemas-microsoft-com:office:office" xmlns:oel="http://schemas.microsoft.com/office/2019/extlst" xmlns:r="http://schemas.openxmlformats.org/officeDocument/2006/relationships" xmlns:m="http://schemas.openxmlformats.org/officeDocument/2006/math" xmlns:v="urn:schemas-microsoft-com:vml" xmlns:wp14="http://schemas.microsoft.com/office/word/2010/wordprocessingDrawing" xmlns:wp="http://schemas.openxmlformats.org/drawingml/2006/wordprocessingDrawing" xmlns:w10="urn:schemas-microsoft-com:office:word" xmlns:w="http://schemas.openxmlformats.org/wordprocessingml/2006/main" xmlns:w14="http://schemas.microsoft.com/office/word/2010/wordml" xmlns:w15="http://schemas.microsoft.com/office/word/2012/wordml" xmlns:w16cex="http://schemas.microsoft.com/office/word/2018/wordml/cex" xmlns:w16cid="http://schemas.microsoft.com/office/word/2016/wordml/cid" xmlns:w16="http://schemas.microsoft.com/office/word/2018/wordml" xmlns:w16sdtdh="http://schemas.microsoft.com/office/word/2020/wordml/sdtdatahash" xmlns:w16se="http://schemas.microsoft.com/office/word/2015/wordml/symex" xmlns:wpg="http://schemas.microsoft.com/office/word/2010/wordprocessingGroup" xmlns:wpi="http://schemas.microsoft.com/office/word/2010/wordprocessingInk" xmlns:wne="http://schemas.microsoft.com/office/word/2006/wordml" xmlns:wps="http://schemas.microsoft.com/office/word/2010/wordprocessingShape" mc:Ignorable="w14 w15 w16se w16cid w16 w16cex w16sdtdh wp14">
+  <w15:commentEx w15:paraId="21D44FCD" w15:done="0"/>
+  <w15:commentEx w15:paraId="2AFDF23B" w15:done="0"/>
+</w15:commentsEx>
+</file>
+
+<file path=word/commentsExtensible.xml><?xml version="1.0" encoding="utf-8"?>
+<w16cex:commentsExtensible xmlns:wpc="http://schemas.microsoft.com/office/word/2010/wordprocessingCanvas" xmlns:cx="http://schemas.microsoft.com/office/drawing/2014/chartex" xmlns:cx1="http://schemas.microsoft.com/office/drawing/2015/9/8/chartex" xmlns:cx2="http://schemas.microsoft.com/office/drawing/2015/10/21/chartex" xmlns:cx3="http://schemas.microsoft.com/office/drawing/2016/5/9/chartex" xmlns:cx4="http://schemas.microsoft.com/office/drawing/2016/5/10/chartex" xmlns:cx5="http://schemas.microsoft.com/office/drawing/2016/5/11/chartex" xmlns:cx6="http://schemas.microsoft.com/office/drawing/2016/5/12/chartex" xmlns:cx7="http://schemas.microsoft.com/office/drawing/2016/5/13/chartex" xmlns:cx8="http://schemas.microsoft.com/office/drawing/2016/5/14/chartex" xmlns:mc="http://schemas.openxmlformats.org/markup-compatibility/2006" xmlns:aink="http://schemas.microsoft.com/office/drawing/2016/ink" xmlns:am3d="http://schemas.microsoft.com/office/drawing/2017/model3d" xmlns:o="urn:schemas-microsoft-com:office:office" xmlns:oel="http://schemas.microsoft.com/office/2019/extlst" xmlns:r="http://schemas.openxmlformats.org/officeDocument/2006/relationships" xmlns:m="http://schemas.openxmlformats.org/officeDocument/2006/math" xmlns:v="urn:schemas-microsoft-com:vml" xmlns:wp14="http://schemas.microsoft.com/office/word/2010/wordprocessingDrawing" xmlns:wp="http://schemas.openxmlformats.org/drawingml/2006/wordprocessingDrawing" xmlns:w10="urn:schemas-microsoft-com:office:word" xmlns:w="http://schemas.openxmlformats.org/wordprocessingml/2006/main" xmlns:w14="http://schemas.microsoft.com/office/word/2010/wordml" xmlns:w15="http://schemas.microsoft.com/office/word/2012/wordml" xmlns:w16cex="http://schemas.microsoft.com/office/word/2018/wordml/cex" xmlns:w16cid="http://schemas.microsoft.com/office/word/2016/wordml/cid" xmlns:w16="http://schemas.microsoft.com/office/word/2018/wordml" xmlns:w16sdtdh="http://schemas.microsoft.com/office/word/2020/wordml/sdtdatahash" xmlns:w16se="http://schemas.microsoft.com/office/word/2015/wordml/symex" xmlns:wpg="http://schemas.microsoft.com/office/word/2010/wordprocessingGroup" xmlns:wpi="http://schemas.microsoft.com/office/word/2010/wordprocessingInk" xmlns:wne="http://schemas.microsoft.com/office/word/2006/wordml" xmlns:wps="http://schemas.microsoft.com/office/word/2010/wordprocessingShape" mc:Ignorable="w14 w15 w16se w16cid w16 w16cex w16sdtdh wp14">
+  <w16cex:commentExtensible w16cex:durableId="53DC5D74" w16cex:dateUtc="2026-04-09T07:46:00Z"/>
+  <w16cex:commentExtensible w16cex:durableId="344707D8" w16cex:dateUtc="2026-04-09T07:45:00Z"/>
+</w16cex:commentsExtensible>
+</file>
+
+<file path=word/commentsIds.xml><?xml version="1.0" encoding="utf-8"?>
+<w16cid:commentsIds xmlns:wpc="http://schemas.microsoft.com/office/word/2010/wordprocessingCanvas" xmlns:cx="http://schemas.microsoft.com/office/drawing/2014/chartex" xmlns:cx1="http://schemas.microsoft.com/office/drawing/2015/9/8/chartex" xmlns:cx2="http://schemas.microsoft.com/office/drawing/2015/10/21/chartex" xmlns:cx3="http://schemas.microsoft.com/office/drawing/2016/5/9/chartex" xmlns:cx4="http://schemas.microsoft.com/office/drawing/2016/5/10/chartex" xmlns:cx5="http://schemas.microsoft.com/office/drawing/2016/5/11/chartex" xmlns:cx6="http://schemas.microsoft.com/office/drawing/2016/5/12/chartex" xmlns:cx7="http://schemas.microsoft.com/office/drawing/2016/5/13/chartex" xmlns:cx8="http://schemas.microsoft.com/office/drawing/2016/5/14/chartex" xmlns:mc="http://schemas.openxmlformats.org/markup-compatibility/2006" xmlns:aink="http://schemas.microsoft.com/office/drawing/2016/ink" xmlns:am3d="http://schemas.microsoft.com/office/drawing/2017/model3d" xmlns:o="urn:schemas-microsoft-com:office:office" xmlns:oel="http://schemas.microsoft.com/office/2019/extlst" xmlns:r="http://schemas.openxmlformats.org/officeDocument/2006/relationships" xmlns:m="http://schemas.openxmlformats.org/officeDocument/2006/math" xmlns:v="urn:schemas-microsoft-com:vml" xmlns:wp14="http://schemas.microsoft.com/office/word/2010/wordprocessingDrawing" xmlns:wp="http://schemas.openxmlformats.org/drawingml/2006/wordprocessingDrawing" xmlns:w10="urn:schemas-microsoft-com:office:word" xmlns:w="http://schemas.openxmlformats.org/wordprocessingml/2006/main" xmlns:w14="http://schemas.microsoft.com/office/word/2010/wordml" xmlns:w15="http://schemas.microsoft.com/office/word/2012/wordml" xmlns:w16cex="http://schemas.microsoft.com/office/word/2018/wordml/cex" xmlns:w16cid="http://schemas.microsoft.com/office/word/2016/wordml/cid" xmlns:w16="http://schemas.microsoft.com/office/word/2018/wordml" xmlns:w16sdtdh="http://schemas.microsoft.com/office/word/2020/wordml/sdtdatahash" xmlns:w16se="http://schemas.microsoft.com/office/word/2015/wordml/symex" xmlns:wpg="http://schemas.microsoft.com/office/word/2010/wordprocessingGroup" xmlns:wpi="http://schemas.microsoft.com/office/word/2010/wordprocessingInk" xmlns:wne="http://schemas.microsoft.com/office/word/2006/wordml" xmlns:wps="http://schemas.microsoft.com/office/word/2010/wordprocessingShape" mc:Ignorable="w14 w15 w16se w16cid w16 w16cex w16sdtdh wp14">
+  <w16cid:commentId w16cid:paraId="21D44FCD" w16cid:durableId="53DC5D74"/>
+  <w16cid:commentId w16cid:paraId="2AFDF23B" w16cid:durableId="344707D8"/>
+</w16cid:commentsIds>
+</file>
+
+<file path=word/numbering.xml><?xml version="1.0" encoding="utf-8"?>
+<w:numbering xmlns:wpc="http://schemas.microsoft.com/office/word/2010/wordprocessingCanvas" xmlns:cx="http://schemas.microsoft.com/office/drawing/2014/chartex" xmlns:cx1="http://schemas.microsoft.com/office/drawing/2015/9/8/chartex" xmlns:cx2="http://schemas.microsoft.com/office/drawing/2015/10/21/chartex" xmlns:cx3="http://schemas.microsoft.com/office/drawing/2016/5/9/chartex" xmlns:cx4="http://schemas.microsoft.com/office/drawing/2016/5/10/chartex" xmlns:cx5="http://schemas.microsoft.com/office/drawing/2016/5/11/chartex" xmlns:cx6="http://schemas.microsoft.com/office/drawing/2016/5/12/chartex" xmlns:cx7="http://schemas.microsoft.com/office/drawing/2016/5/13/chartex" xmlns:cx8="http://schemas.microsoft.com/office/drawing/2016/5/14/chartex" xmlns:mc="http://schemas.openxmlformats.org/markup-compatibility/2006" xmlns:aink="http://schemas.microsoft.com/office/drawing/2016/ink" xmlns:am3d="http://schemas.microsoft.com/office/drawing/2017/model3d" xmlns:o="urn:schemas-microsoft-com:office:office" xmlns:oel="http://schemas.microsoft.com/office/2019/extlst" xmlns:r="http://schemas.openxmlformats.org/officeDocument/2006/relationships" xmlns:m="http://schemas.openxmlformats.org/officeDocument/2006/math" xmlns:v="urn:schemas-microsoft-com:vml" xmlns:wp14="http://schemas.microsoft.com/office/word/2010/wordprocessingDrawing" xmlns:wp="http://schemas.openxmlformats.org/drawingml/2006/wordprocessingDrawing" xmlns:w10="urn:schemas-microsoft-com:office:word" xmlns:w="http://schemas.openxmlformats.org/wordprocessingml/2006/main" xmlns:w14="http://schemas.microsoft.com/office/word/2010/wordml" xmlns:w15="http://schemas.microsoft.com/office/word/2012/wordml" xmlns:w16cex="http://schemas.microsoft.com/office/word/2018/wordml/cex" xmlns:w16cid="http://schemas.microsoft.com/office/word/2016/wordml/cid" xmlns:w16="http://schemas.microsoft.com/office/word/2018/wordml" xmlns:w16sdtdh="http://schemas.microsoft.com/office/word/2020/wordml/sdtdatahash" xmlns:w16se="http://schemas.microsoft.com/office/word/2015/wordml/symex" xmlns:wpg="http://schemas.microsoft.com/office/word/2010/wordprocessingGroup" xmlns:wpi="http://schemas.microsoft.com/office/word/2010/wordprocessingInk" xmlns:wne="http://schemas.microsoft.com/office/word/2006/wordml" xmlns:wps="http://schemas.microsoft.com/office/word/2010/wordprocessingShape" mc:Ignorable="w14 w15 w16se w16cid w16 w16cex w16sdtdh wp14">
+  <w:abstractNum w:abstractNumId="0" w15:restartNumberingAfterBreak="0">
+    <w:nsid w:val="7F8C612E"/>
+    <w:multiLevelType w:val="multilevel"/>
+    <w:tmpl w:val="B95A48F0"/>
+    <w:lvl w:ilvl="0">
+      <w:start w:val="1"/>
+      <w:numFmt w:val="bullet"/>
+      <w:lvlText w:val=""/>
+      <w:lvlJc w:val="left"/>
+      <w:pPr>
+        <w:tabs>
+          <w:tab w:val="num" w:pos="720"/>
+        </w:tabs>
+        <w:ind w:left="720" w:hanging="360"/>
+      </w:pPr>
+      <w:rPr>
+        <w:rFonts w:ascii="Symbol" w:hAnsi="Symbol" w:hint="default"/>
+        <w:sz w:val="20"/>
+      </w:rPr>
+    </w:lvl>
+    <w:lvl w:ilvl="1" w:tentative="1">
+      <w:start w:val="1"/>
+      <w:numFmt w:val="bullet"/>
+      <w:lvlText w:val="o"/>
+      <w:lvlJc w:val="left"/>
+      <w:pPr>
+        <w:tabs>
+          <w:tab w:val="num" w:pos="1440"/>
+        </w:tabs>
+        <w:ind w:left="1440" w:hanging="360"/>
+      </w:pPr>
+      <w:rPr>
+        <w:rFonts w:ascii="Courier New" w:hAnsi="Courier New" w:hint="default"/>
+        <w:sz w:val="20"/>
+      </w:rPr>
+    </w:lvl>
+    <w:lvl w:ilvl="2" w:tentative="1">
+      <w:start w:val="1"/>
+      <w:numFmt w:val="bullet"/>
+      <w:lvlText w:val=""/>
+      <w:lvlJc w:val="left"/>
+      <w:pPr>
+        <w:tabs>
+          <w:tab w:val="num" w:pos="2160"/>
+        </w:tabs>
+        <w:ind w:left="2160" w:hanging="360"/>
+      </w:pPr>
+      <w:rPr>
+        <w:rFonts w:ascii="Wingdings" w:hAnsi="Wingdings" w:hint="default"/>
+        <w:sz w:val="20"/>
+      </w:rPr>
+    </w:lvl>
+    <w:lvl w:ilvl="3" w:tentative="1">
+      <w:start w:val="1"/>
+      <w:numFmt w:val="bullet"/>
+      <w:lvlText w:val=""/>
+      <w:lvlJc w:val="left"/>
+      <w:pPr>
+        <w:tabs>
+          <w:tab w:val="num" w:pos="2880"/>
+        </w:tabs>
+        <w:ind w:left="2880" w:hanging="360"/>
+      </w:pPr>
+      <w:rPr>
+        <w:rFonts w:ascii="Wingdings" w:hAnsi="Wingdings" w:hint="default"/>
+        <w:sz w:val="20"/>
+      </w:rPr>
+    </w:lvl>
+    <w:lvl w:ilvl="4" w:tentative="1">
+      <w:start w:val="1"/>
+      <w:numFmt w:val="bullet"/>
+      <w:lvlText w:val=""/>
+      <w:lvlJc w:val="left"/>
+      <w:pPr>
+        <w:tabs>
+          <w:tab w:val="num" w:pos="3600"/>
+        </w:tabs>
+        <w:ind w:left="3600" w:hanging="360"/>
+      </w:pPr>
+      <w:rPr>
+        <w:rFonts w:ascii="Wingdings" w:hAnsi="Wingdings" w:hint="default"/>
+        <w:sz w:val="20"/>
+      </w:rPr>
+    </w:lvl>
+    <w:lvl w:ilvl="5" w:tentative="1">
+      <w:start w:val="1"/>
+      <w:numFmt w:val="bullet"/>
+      <w:lvlText w:val=""/>
+      <w:lvlJc w:val="left"/>
+      <w:pPr>
+        <w:tabs>
+          <w:tab w:val="num" w:pos="4320"/>
+        </w:tabs>
+        <w:ind w:left="4320" w:hanging="360"/>
+      </w:pPr>
+      <w:rPr>
+        <w:rFonts w:ascii="Wingdings" w:hAnsi="Wingdings" w:hint="default"/>
+        <w:sz w:val="20"/>
+      </w:rPr>
+    </w:lvl>
+    <w:lvl w:ilvl="6" w:tentative="1">
+      <w:start w:val="1"/>
+      <w:numFmt w:val="bullet"/>
+      <w:lvlText w:val=""/>
+      <w:lvlJc w:val="left"/>
+      <w:pPr>
+        <w:tabs>
+          <w:tab w:val="num" w:pos="5040"/>
+        </w:tabs>
+        <w:ind w:left="5040" w:hanging="360"/>
+      </w:pPr>
+      <w:rPr>
+        <w:rFonts w:ascii="Wingdings" w:hAnsi="Wingdings" w:hint="default"/>
+        <w:sz w:val="20"/>
+      </w:rPr>
+    </w:lvl>
+    <w:lvl w:ilvl="7" w:tentative="1">
+      <w:start w:val="1"/>
+      <w:numFmt w:val="bullet"/>
+      <w:lvlText w:val=""/>
+      <w:lvlJc w:val="left"/>
+      <w:pPr>
+        <w:tabs>
+          <w:tab w:val="num" w:pos="5760"/>
+        </w:tabs>
+        <w:ind w:left="5760" w:hanging="360"/>
+      </w:pPr>
+      <w:rPr>
+        <w:rFonts w:ascii="Wingdings" w:hAnsi="Wingdings" w:hint="default"/>
+        <w:sz w:val="20"/>
+      </w:rPr>
+    </w:lvl>
+    <w:lvl w:ilvl="8" w:tentative="1">
+      <w:start w:val="1"/>
+      <w:numFmt w:val="bullet"/>
+      <w:lvlText w:val=""/>
+      <w:lvlJc w:val="left"/>
+      <w:pPr>
+        <w:tabs>
+          <w:tab w:val="num" w:pos="6480"/>
+        </w:tabs>
+        <w:ind w:left="6480" w:hanging="360"/>
+      </w:pPr>
+      <w:rPr>
+        <w:rFonts w:ascii="Wingdings" w:hAnsi="Wingdings" w:hint="default"/>
+        <w:sz w:val="20"/>
+      </w:rPr>
+    </w:lvl>
+  </w:abstractNum>
+  <w:num w:numId="1" w16cid:durableId="1066758071">
+    <w:abstractNumId w:val="0"/>
+  </w:num>
+</w:numbering>
+</file>
+
+<file path=word/people.xml><?xml version="1.0" encoding="utf-8"?>
+<w15:people xmlns:wpc="http://schemas.microsoft.com/office/word/2010/wordprocessingCanvas" xmlns:cx="http://schemas.microsoft.com/office/drawing/2014/chartex" xmlns:cx1="http://schemas.microsoft.com/office/drawing/2015/9/8/chartex" xmlns:cx2="http://schemas.microsoft.com/office/drawing/2015/10/21/chartex" xmlns:cx3="http://schemas.microsoft.com/office/drawing/2016/5/9/chartex" xmlns:cx4="http://schemas.microsoft.com/office/drawing/2016/5/10/chartex" xmlns:cx5="http://schemas.microsoft.com/office/drawing/2016/5/11/chartex" xmlns:cx6="http://schemas.microsoft.com/office/drawing/2016/5/12/chartex" xmlns:cx7="http://schemas.microsoft.com/office/drawing/2016/5/13/chartex" xmlns:cx8="http://schemas.microsoft.com/office/drawing/2016/5/14/chartex" xmlns:mc="http://schemas.openxmlformats.org/markup-compatibility/2006" xmlns:aink="http://schemas.microsoft.com/office/drawing/2016/ink" xmlns:am3d="http://schemas.microsoft.com/office/drawing/2017/model3d" xmlns:o="urn:schemas-microsoft-com:office:office" xmlns:oel="http://schemas.microsoft.com/office/2019/extlst" xmlns:r="http://schemas.openxmlformats.org/officeDocument/2006/relationships" xmlns:m="http://schemas.openxmlformats.org/officeDocument/2006/math" xmlns:v="urn:schemas-microsoft-com:vml" xmlns:wp14="http://schemas.microsoft.com/office/word/2010/wordprocessingDrawing" xmlns:wp="http://schemas.openxmlformats.org/drawingml/2006/wordprocessingDrawing" xmlns:w10="urn:schemas-microsoft-com:office:word" xmlns:w="http://schemas.openxmlformats.org/wordprocessingml/2006/main" xmlns:w14="http://schemas.microsoft.com/office/word/2010/wordml" xmlns:w15="http://schemas.microsoft.com/office/word/2012/wordml" xmlns:w16cex="http://schemas.microsoft.com/office/word/2018/wordml/cex" xmlns:w16cid="http://schemas.microsoft.com/office/word/2016/wordml/cid" xmlns:w16="http://schemas.microsoft.com/office/word/2018/wordml" xmlns:w16sdtdh="http://schemas.microsoft.com/office/word/2020/wordml/sdtdatahash" xmlns:w16se="http://schemas.microsoft.com/office/word/2015/wordml/symex" xmlns:wpg="http://schemas.microsoft.com/office/word/2010/wordprocessingGroup" xmlns:wpi="http://schemas.microsoft.com/office/word/2010/wordprocessingInk" xmlns:wne="http://schemas.microsoft.com/office/word/2006/wordml" xmlns:wps="http://schemas.microsoft.com/office/word/2010/wordprocessingShape" mc:Ignorable="w14 w15 w16se w16cid w16 w16cex w16sdtdh wp14">
+  <w15:person w15:author="Haniyeh Jebelli">
+    <w15:presenceInfo w15:providerId="Windows Live" w15:userId="0f3d3abafb461aa3"/>
+  </w15:person>
+</w15:people>
+</file>
+
 <file path=word/styles.xml><?xml version="1.0" encoding="utf-8"?>
-<w:styles xmlns:mc="http://schemas.openxmlformats.org/markup-compatibility/2006" xmlns:r="http://schemas.openxmlformats.org/officeDocument/2006/relationships" xmlns:w="http://schemas.openxmlformats.org/wordprocessingml/2006/main" xmlns:w14="http://schemas.microsoft.com/office/word/2010/wordml" xmlns:w15="http://schemas.microsoft.com/office/word/2012/wordml" xmlns:w16cex="http://schemas.microsoft.com/office/word/2018/wordml/cex" xmlns:w16cid="http://schemas.microsoft.com/office/word/2016/wordml/cid" xmlns:w16="http://schemas.microsoft.com/office/word/2018/wordml" xmlns:w16du="http://schemas.microsoft.com/office/word/2023/wordml/word16du" xmlns:w16sdtdh="http://schemas.microsoft.com/office/word/2020/wordml/sdtdatahash" xmlns:w16sdtfl="http://schemas.microsoft.com/office/word/2024/wordml/sdtformatlock" xmlns:w16se="http://schemas.microsoft.com/office/word/2015/wordml/symex" mc:Ignorable="w14 w15 w16se w16cid w16 w16cex w16sdtdh w16sdtfl w16du">
+<w:styles xmlns:mc="http://schemas.openxmlformats.org/markup-compatibility/2006" xmlns:r="http://schemas.openxmlformats.org/officeDocument/2006/relationships" xmlns:w="http://schemas.openxmlformats.org/wordprocessingml/2006/main" xmlns:w14="http://schemas.microsoft.com/office/word/2010/wordml" xmlns:w15="http://schemas.microsoft.com/office/word/2012/wordml" xmlns:w16cex="http://schemas.microsoft.com/office/word/2018/wordml/cex" xmlns:w16cid="http://schemas.microsoft.com/office/word/2016/wordml/cid" xmlns:w16="http://schemas.microsoft.com/office/word/2018/wordml" xmlns:w16sdtdh="http://schemas.microsoft.com/office/word/2020/wordml/sdtdatahash" xmlns:w16se="http://schemas.microsoft.com/office/word/2015/wordml/symex" mc:Ignorable="w14 w15 w16se w16cid w16 w16cex w16sdtdh">
   <w:docDefaults>
     <w:rPrDefault>
       <w:rPr>
@@ -3158,6 +3768,113 @@
       </w:tblCellMar>
     </w:tblPr>
   </w:style>
+  <w:style w:type="character" w:styleId="CommentReference">
+    <w:name w:val="annotation reference"/>
+    <w:basedOn w:val="DefaultParagraphFont"/>
+    <w:uiPriority w:val="99"/>
+    <w:semiHidden/>
+    <w:unhideWhenUsed/>
+    <w:rsid w:val="004D6CD2"/>
+    <w:rPr>
+      <w:sz w:val="16"/>
+      <w:szCs w:val="16"/>
+    </w:rPr>
+  </w:style>
+  <w:style w:type="paragraph" w:styleId="CommentText">
+    <w:name w:val="annotation text"/>
+    <w:basedOn w:val="Normal"/>
+    <w:link w:val="CommentTextChar"/>
+    <w:uiPriority w:val="99"/>
+    <w:semiHidden/>
+    <w:unhideWhenUsed/>
+    <w:rsid w:val="004D6CD2"/>
+    <w:pPr>
+      <w:spacing w:line="240" w:lineRule="auto"/>
+    </w:pPr>
+    <w:rPr>
+      <w:sz w:val="20"/>
+      <w:szCs w:val="20"/>
+    </w:rPr>
+  </w:style>
+  <w:style w:type="character" w:customStyle="1" w:styleId="CommentTextChar">
+    <w:name w:val="Comment Text Char"/>
+    <w:basedOn w:val="DefaultParagraphFont"/>
+    <w:link w:val="CommentText"/>
+    <w:uiPriority w:val="99"/>
+    <w:semiHidden/>
+    <w:rsid w:val="004D6CD2"/>
+    <w:rPr>
+      <w:sz w:val="20"/>
+      <w:szCs w:val="20"/>
+    </w:rPr>
+  </w:style>
+  <w:style w:type="paragraph" w:styleId="CommentSubject">
+    <w:name w:val="annotation subject"/>
+    <w:basedOn w:val="CommentText"/>
+    <w:next w:val="CommentText"/>
+    <w:link w:val="CommentSubjectChar"/>
+    <w:uiPriority w:val="99"/>
+    <w:semiHidden/>
+    <w:unhideWhenUsed/>
+    <w:rsid w:val="004D6CD2"/>
+    <w:rPr>
+      <w:b/>
+      <w:bCs/>
+    </w:rPr>
+  </w:style>
+  <w:style w:type="character" w:customStyle="1" w:styleId="CommentSubjectChar">
+    <w:name w:val="Comment Subject Char"/>
+    <w:basedOn w:val="CommentTextChar"/>
+    <w:link w:val="CommentSubject"/>
+    <w:uiPriority w:val="99"/>
+    <w:semiHidden/>
+    <w:rsid w:val="004D6CD2"/>
+    <w:rPr>
+      <w:b/>
+      <w:bCs/>
+      <w:sz w:val="20"/>
+      <w:szCs w:val="20"/>
+    </w:rPr>
+  </w:style>
+  <w:style w:type="paragraph" w:customStyle="1" w:styleId="font-claude-response-body">
+    <w:name w:val="font-claude-response-body"/>
+    <w:basedOn w:val="Normal"/>
+    <w:rsid w:val="004D6CD2"/>
+    <w:pPr>
+      <w:spacing w:before="100" w:beforeAutospacing="1" w:after="100" w:afterAutospacing="1" w:line="240" w:lineRule="auto"/>
+    </w:pPr>
+    <w:rPr>
+      <w:rFonts w:ascii="Times New Roman" w:eastAsia="Times New Roman" w:hAnsi="Times New Roman" w:cs="Times New Roman"/>
+      <w:sz w:val="24"/>
+      <w:szCs w:val="24"/>
+      <w:lang w:val="en-CH"/>
+    </w:rPr>
+  </w:style>
+  <w:style w:type="paragraph" w:customStyle="1" w:styleId="whitespace-normal">
+    <w:name w:val="whitespace-normal"/>
+    <w:basedOn w:val="Normal"/>
+    <w:rsid w:val="004D6CD2"/>
+    <w:pPr>
+      <w:spacing w:before="100" w:beforeAutospacing="1" w:after="100" w:afterAutospacing="1" w:line="240" w:lineRule="auto"/>
+    </w:pPr>
+    <w:rPr>
+      <w:rFonts w:ascii="Times New Roman" w:eastAsia="Times New Roman" w:hAnsi="Times New Roman" w:cs="Times New Roman"/>
+      <w:sz w:val="24"/>
+      <w:szCs w:val="24"/>
+      <w:lang w:val="en-CH"/>
+    </w:rPr>
+  </w:style>
+  <w:style w:type="character" w:styleId="Strong">
+    <w:name w:val="Strong"/>
+    <w:basedOn w:val="DefaultParagraphFont"/>
+    <w:uiPriority w:val="22"/>
+    <w:qFormat/>
+    <w:rsid w:val="004D6CD2"/>
+    <w:rPr>
+      <w:b/>
+      <w:bCs/>
+    </w:rPr>
+  </w:style>
 </w:styles>
 </file>
 

</xml_diff>